<commit_message>
1. Add sessions 5 and 6
</commit_message>
<xml_diff>
--- a/Prerequisites/Instructions_Setup.docx
+++ b/Prerequisites/Instructions_Setup.docx
@@ -2219,6 +2219,32 @@
         <w:rPr>
           <w:lang w:val="en-US"/>
         </w:rPr>
+        <w:t>/</w:t>
+      </w:r>
+      <w:r>
+        <w:rPr>
+          <w:lang w:val="en-US"/>
+        </w:rPr>
+        <w:t>Prerequisites</w:t>
+      </w:r>
+      <w:r>
+        <w:rPr>
+          <w:lang w:val="en-US"/>
+        </w:rPr>
+        <w:t>/</w:t>
+      </w:r>
+      <w:proofErr w:type="spellStart"/>
+      <w:r>
+        <w:rPr>
+          <w:lang w:val="en-US"/>
+        </w:rPr>
+        <w:t>Setup_and_testing</w:t>
+      </w:r>
+      <w:proofErr w:type="spellEnd"/>
+      <w:r>
+        <w:rPr>
+          <w:lang w:val="en-US"/>
+        </w:rPr>
         <w:t xml:space="preserve">” folder created in step 3. </w:t>
       </w:r>
       <w:r>
@@ -2251,6 +2277,32 @@
         <w:rPr>
           <w:lang w:val="en-US"/>
         </w:rPr>
+        <w:t>/</w:t>
+      </w:r>
+      <w:r>
+        <w:rPr>
+          <w:lang w:val="en-US"/>
+        </w:rPr>
+        <w:t>Prerequisites</w:t>
+      </w:r>
+      <w:r>
+        <w:rPr>
+          <w:lang w:val="en-US"/>
+        </w:rPr>
+        <w:t>/</w:t>
+      </w:r>
+      <w:proofErr w:type="spellStart"/>
+      <w:r>
+        <w:rPr>
+          <w:lang w:val="en-US"/>
+        </w:rPr>
+        <w:t>Setup_and_testing</w:t>
+      </w:r>
+      <w:proofErr w:type="spellEnd"/>
+      <w:r>
+        <w:rPr>
+          <w:lang w:val="en-US"/>
+        </w:rPr>
         <w:t xml:space="preserve">” </w:t>
       </w:r>
       <w:r>
@@ -2290,6 +2342,30 @@
         </w:rPr>
         <w:t>ML_course</w:t>
       </w:r>
+      <w:r>
+        <w:rPr>
+          <w:lang w:val="en-US"/>
+        </w:rPr>
+        <w:t>/</w:t>
+      </w:r>
+      <w:r>
+        <w:rPr>
+          <w:lang w:val="en-US"/>
+        </w:rPr>
+        <w:t>Prerequisites</w:t>
+      </w:r>
+      <w:r>
+        <w:rPr>
+          <w:lang w:val="en-US"/>
+        </w:rPr>
+        <w:t>/</w:t>
+      </w:r>
+      <w:r>
+        <w:rPr>
+          <w:lang w:val="en-US"/>
+        </w:rPr>
+        <w:t>Setup_and_testing</w:t>
+      </w:r>
     </w:p>
     <w:p>
       <w:pPr>
@@ -2336,6 +2412,30 @@
           <w:lang w:val="en-US"/>
         </w:rPr>
         <w:t>ML_course</w:t>
+      </w:r>
+      <w:r>
+        <w:rPr>
+          <w:lang w:val="en-US"/>
+        </w:rPr>
+        <w:t>/</w:t>
+      </w:r>
+      <w:r>
+        <w:rPr>
+          <w:lang w:val="en-US"/>
+        </w:rPr>
+        <w:t>Prerequisites</w:t>
+      </w:r>
+      <w:r>
+        <w:rPr>
+          <w:lang w:val="en-US"/>
+        </w:rPr>
+        <w:t>/</w:t>
+      </w:r>
+      <w:r>
+        <w:rPr>
+          <w:lang w:val="en-US"/>
+        </w:rPr>
+        <w:t>Setup_and_testing</w:t>
       </w:r>
     </w:p>
     <w:p>
@@ -2572,9 +2672,11 @@
           <w:szCs w:val="40"/>
           <w:lang w:val="en-US"/>
         </w:rPr>
-        <w:t xml:space="preserve">5. </w:t>
-      </w:r>
-      <w:r>
+        <w:br w:type="page"/>
+      </w:r>
+    </w:p>
+    <w:p>
+      <w:pPr>
         <w:rPr>
           <w:rFonts w:asciiTheme="majorHAnsi" w:eastAsiaTheme="majorEastAsia" w:hAnsiTheme="majorHAnsi" w:cstheme="majorBidi"/>
           <w:color w:val="0F4761" w:themeColor="accent1" w:themeShade="BF"/>
@@ -2582,6 +2684,26 @@
           <w:szCs w:val="40"/>
           <w:lang w:val="en-US"/>
         </w:rPr>
+      </w:pPr>
+      <w:r>
+        <w:rPr>
+          <w:rFonts w:asciiTheme="majorHAnsi" w:eastAsiaTheme="majorEastAsia" w:hAnsiTheme="majorHAnsi" w:cstheme="majorBidi"/>
+          <w:color w:val="0F4761" w:themeColor="accent1" w:themeShade="BF"/>
+          <w:sz w:val="40"/>
+          <w:szCs w:val="40"/>
+          <w:lang w:val="en-US"/>
+        </w:rPr>
+        <w:lastRenderedPageBreak/>
+        <w:t xml:space="preserve">5. </w:t>
+      </w:r>
+      <w:r>
+        <w:rPr>
+          <w:rFonts w:asciiTheme="majorHAnsi" w:eastAsiaTheme="majorEastAsia" w:hAnsiTheme="majorHAnsi" w:cstheme="majorBidi"/>
+          <w:color w:val="0F4761" w:themeColor="accent1" w:themeShade="BF"/>
+          <w:sz w:val="40"/>
+          <w:szCs w:val="40"/>
+          <w:lang w:val="en-US"/>
+        </w:rPr>
         <w:t>How to use Visual Studio Code and check the set up</w:t>
       </w:r>
     </w:p>
@@ -2707,7 +2829,59 @@
         <w:rPr>
           <w:lang w:val="en-US"/>
         </w:rPr>
-        <w:t xml:space="preserve"> Notebook unzipped from the previous step.</w:t>
+        <w:t xml:space="preserve"> Notebook unzipped from the previous step</w:t>
+      </w:r>
+      <w:r>
+        <w:rPr>
+          <w:lang w:val="en-US"/>
+        </w:rPr>
+        <w:t xml:space="preserve"> (in the “</w:t>
+      </w:r>
+      <w:proofErr w:type="spellStart"/>
+      <w:r>
+        <w:rPr>
+          <w:lang w:val="en-US"/>
+        </w:rPr>
+        <w:t>ML_course</w:t>
+      </w:r>
+      <w:proofErr w:type="spellEnd"/>
+      <w:r>
+        <w:rPr>
+          <w:lang w:val="en-US"/>
+        </w:rPr>
+        <w:t>/</w:t>
+      </w:r>
+      <w:r>
+        <w:rPr>
+          <w:lang w:val="en-US"/>
+        </w:rPr>
+        <w:t>Prerequisites</w:t>
+      </w:r>
+      <w:r>
+        <w:rPr>
+          <w:lang w:val="en-US"/>
+        </w:rPr>
+        <w:t>/</w:t>
+      </w:r>
+      <w:proofErr w:type="spellStart"/>
+      <w:r>
+        <w:rPr>
+          <w:lang w:val="en-US"/>
+        </w:rPr>
+        <w:t>Setup_and_testing</w:t>
+      </w:r>
+      <w:proofErr w:type="spellEnd"/>
+      <w:r>
+        <w:rPr>
+          <w:lang w:val="en-US"/>
+        </w:rPr>
+        <w:t>” folder)</w:t>
+      </w:r>
+      <w:r>
+        <w:rPr>
+          <w:lang w:val="en-US"/>
+        </w:rPr>
+        <w:t>.</w:t>
       </w:r>
     </w:p>
     <w:p>
@@ -2749,14 +2923,206 @@
       <w:pPr>
         <w:pStyle w:val="Heading3"/>
         <w:rPr>
-          <w:lang w:val="en-US"/>
-        </w:rPr>
-      </w:pPr>
-      <w:r>
-        <w:rPr>
-          <w:lang w:val="en-US"/>
-        </w:rPr>
-        <w:lastRenderedPageBreak/>
+          <w:b/>
+          <w:bCs/>
+          <w:color w:val="C00000"/>
+          <w:u w:val="single"/>
+          <w:lang w:val="en-US"/>
+        </w:rPr>
+      </w:pPr>
+      <w:r>
+        <w:rPr>
+          <w:b/>
+          <w:bCs/>
+          <w:color w:val="C00000"/>
+          <w:u w:val="single"/>
+          <w:lang w:val="en-US"/>
+        </w:rPr>
+        <w:t>VERY IMPORTANT!</w:t>
+      </w:r>
+    </w:p>
+    <w:p>
+      <w:pPr>
+        <w:jc w:val="both"/>
+      </w:pPr>
+      <w:r>
+        <w:t>To open the notebook, do not double-click the file with your mouse. Instead, first</w:t>
+      </w:r>
+      <w:r>
+        <w:t xml:space="preserve"> open VSC</w:t>
+      </w:r>
+      <w:r>
+        <w:t xml:space="preserve"> and</w:t>
+      </w:r>
+      <w:r>
+        <w:t xml:space="preserve"> select “Open Folder”. You will then see the files in your folder listed on the left side of the screen. From there, select the notebook to open it.</w:t>
+      </w:r>
+    </w:p>
+    <w:p>
+      <w:pPr>
+        <w:jc w:val="both"/>
+      </w:pPr>
+      <w:r>
+        <w:t xml:space="preserve">If you don’t follow this process, </w:t>
+      </w:r>
+      <w:r>
+        <w:t xml:space="preserve">VSC might not be able to detect the kernels </w:t>
+      </w:r>
+      <w:r>
+        <w:t>from the points</w:t>
+      </w:r>
+      <w:r>
+        <w:t xml:space="preserve"> below</w:t>
+      </w:r>
+      <w:r>
+        <w:t>.</w:t>
+      </w:r>
+    </w:p>
+    <w:p>
+      <w:pPr>
+        <w:rPr>
+          <w:lang w:val="en-US"/>
+        </w:rPr>
+      </w:pPr>
+      <w:r>
+        <w:rPr>
+          <w:noProof/>
+          <w:lang w:val="en-US"/>
+        </w:rPr>
+        <w:drawing>
+          <wp:inline distT="0" distB="0" distL="0" distR="0" wp14:anchorId="46008A55" wp14:editId="72FA7AB9">
+            <wp:extent cx="4377565" cy="1661160"/>
+            <wp:effectExtent l="0" t="0" r="4445" b="0"/>
+            <wp:docPr id="1549508698" name="Picture 1"/>
+            <wp:cNvGraphicFramePr>
+              <a:graphicFrameLocks xmlns:a="http://schemas.openxmlformats.org/drawingml/2006/main" noChangeAspect="1"/>
+            </wp:cNvGraphicFramePr>
+            <a:graphic xmlns:a="http://schemas.openxmlformats.org/drawingml/2006/main">
+              <a:graphicData uri="http://schemas.openxmlformats.org/drawingml/2006/picture">
+                <pic:pic xmlns:pic="http://schemas.openxmlformats.org/drawingml/2006/picture">
+                  <pic:nvPicPr>
+                    <pic:cNvPr id="0" name="Picture 1"/>
+                    <pic:cNvPicPr>
+                      <a:picLocks noChangeAspect="1" noChangeArrowheads="1"/>
+                    </pic:cNvPicPr>
+                  </pic:nvPicPr>
+                  <pic:blipFill rotWithShape="1">
+                    <a:blip r:embed="rId13">
+                      <a:extLst>
+                        <a:ext uri="{28A0092B-C50C-407E-A947-70E740481C1C}">
+                          <a14:useLocalDpi xmlns:a14="http://schemas.microsoft.com/office/drawing/2010/main" val="0"/>
+                        </a:ext>
+                      </a:extLst>
+                    </a:blip>
+                    <a:srcRect b="43388"/>
+                    <a:stretch>
+                      <a:fillRect/>
+                    </a:stretch>
+                  </pic:blipFill>
+                  <pic:spPr bwMode="auto">
+                    <a:xfrm>
+                      <a:off x="0" y="0"/>
+                      <a:ext cx="4380078" cy="1662114"/>
+                    </a:xfrm>
+                    <a:prstGeom prst="rect">
+                      <a:avLst/>
+                    </a:prstGeom>
+                    <a:noFill/>
+                    <a:ln>
+                      <a:noFill/>
+                    </a:ln>
+                    <a:extLst>
+                      <a:ext uri="{53640926-AAD7-44D8-BBD7-CCE9431645EC}">
+                        <a14:shadowObscured xmlns:a14="http://schemas.microsoft.com/office/drawing/2010/main"/>
+                      </a:ext>
+                    </a:extLst>
+                  </pic:spPr>
+                </pic:pic>
+              </a:graphicData>
+            </a:graphic>
+          </wp:inline>
+        </w:drawing>
+      </w:r>
+    </w:p>
+    <w:p>
+      <w:pPr>
+        <w:rPr>
+          <w:lang w:val="en-US"/>
+        </w:rPr>
+      </w:pPr>
+      <w:r>
+        <w:rPr>
+          <w:noProof/>
+          <w:lang w:val="en-US"/>
+        </w:rPr>
+        <w:drawing>
+          <wp:inline distT="0" distB="0" distL="0" distR="0" wp14:anchorId="5E9A102C" wp14:editId="638A8D5D">
+            <wp:extent cx="2902244" cy="1691640"/>
+            <wp:effectExtent l="0" t="0" r="0" b="3810"/>
+            <wp:docPr id="1995852653" name="Picture 2"/>
+            <wp:cNvGraphicFramePr>
+              <a:graphicFrameLocks xmlns:a="http://schemas.openxmlformats.org/drawingml/2006/main" noChangeAspect="1"/>
+            </wp:cNvGraphicFramePr>
+            <a:graphic xmlns:a="http://schemas.openxmlformats.org/drawingml/2006/main">
+              <a:graphicData uri="http://schemas.openxmlformats.org/drawingml/2006/picture">
+                <pic:pic xmlns:pic="http://schemas.openxmlformats.org/drawingml/2006/picture">
+                  <pic:nvPicPr>
+                    <pic:cNvPr id="0" name="Picture 2"/>
+                    <pic:cNvPicPr>
+                      <a:picLocks noChangeAspect="1" noChangeArrowheads="1"/>
+                    </pic:cNvPicPr>
+                  </pic:nvPicPr>
+                  <pic:blipFill>
+                    <a:blip r:embed="rId14">
+                      <a:extLst>
+                        <a:ext uri="{28A0092B-C50C-407E-A947-70E740481C1C}">
+                          <a14:useLocalDpi xmlns:a14="http://schemas.microsoft.com/office/drawing/2010/main" val="0"/>
+                        </a:ext>
+                      </a:extLst>
+                    </a:blip>
+                    <a:srcRect/>
+                    <a:stretch>
+                      <a:fillRect/>
+                    </a:stretch>
+                  </pic:blipFill>
+                  <pic:spPr bwMode="auto">
+                    <a:xfrm>
+                      <a:off x="0" y="0"/>
+                      <a:ext cx="2919213" cy="1701531"/>
+                    </a:xfrm>
+                    <a:prstGeom prst="rect">
+                      <a:avLst/>
+                    </a:prstGeom>
+                    <a:noFill/>
+                    <a:ln>
+                      <a:noFill/>
+                    </a:ln>
+                  </pic:spPr>
+                </pic:pic>
+              </a:graphicData>
+            </a:graphic>
+          </wp:inline>
+        </w:drawing>
+      </w:r>
+    </w:p>
+    <w:p>
+      <w:pPr>
+        <w:rPr>
+          <w:lang w:val="en-US"/>
+        </w:rPr>
+      </w:pPr>
+    </w:p>
+    <w:p>
+      <w:pPr>
+        <w:pStyle w:val="Heading3"/>
+        <w:rPr>
+          <w:lang w:val="en-US"/>
+        </w:rPr>
+      </w:pPr>
+      <w:r>
+        <w:rPr>
+          <w:lang w:val="en-US"/>
+        </w:rPr>
         <w:t>5.</w:t>
       </w:r>
       <w:r>
@@ -2825,7 +3191,7 @@
                     <pic:cNvPicPr/>
                   </pic:nvPicPr>
                   <pic:blipFill>
-                    <a:blip r:embed="rId13"/>
+                    <a:blip r:embed="rId15"/>
                     <a:stretch>
                       <a:fillRect/>
                     </a:stretch>
@@ -2866,6 +3232,7 @@
         <w:rPr>
           <w:lang w:val="en-US"/>
         </w:rPr>
+        <w:lastRenderedPageBreak/>
         <w:t>5.</w:t>
       </w:r>
       <w:r>
@@ -3028,7 +3395,7 @@
                     <pic:cNvPicPr/>
                   </pic:nvPicPr>
                   <pic:blipFill rotWithShape="1">
-                    <a:blip r:embed="rId14"/>
+                    <a:blip r:embed="rId16"/>
                     <a:srcRect b="11761"/>
                     <a:stretch/>
                   </pic:blipFill>
@@ -3345,7 +3712,59 @@
         <w:rPr>
           <w:lang w:val="en-US"/>
         </w:rPr>
-        <w:t xml:space="preserve"> Notebook unzipped from the previous step.</w:t>
+        <w:t xml:space="preserve"> Notebook unzipped from the previous step</w:t>
+      </w:r>
+      <w:r>
+        <w:rPr>
+          <w:lang w:val="en-US"/>
+        </w:rPr>
+        <w:t xml:space="preserve"> (in the “</w:t>
+      </w:r>
+      <w:proofErr w:type="spellStart"/>
+      <w:r>
+        <w:rPr>
+          <w:lang w:val="en-US"/>
+        </w:rPr>
+        <w:t>ML_course</w:t>
+      </w:r>
+      <w:proofErr w:type="spellEnd"/>
+      <w:r>
+        <w:rPr>
+          <w:lang w:val="en-US"/>
+        </w:rPr>
+        <w:t>/</w:t>
+      </w:r>
+      <w:r>
+        <w:rPr>
+          <w:lang w:val="en-US"/>
+        </w:rPr>
+        <w:t>Prerequisites</w:t>
+      </w:r>
+      <w:r>
+        <w:rPr>
+          <w:lang w:val="en-US"/>
+        </w:rPr>
+        <w:t>/</w:t>
+      </w:r>
+      <w:proofErr w:type="spellStart"/>
+      <w:r>
+        <w:rPr>
+          <w:lang w:val="en-US"/>
+        </w:rPr>
+        <w:t>Setup_and_testing</w:t>
+      </w:r>
+      <w:proofErr w:type="spellEnd"/>
+      <w:r>
+        <w:rPr>
+          <w:lang w:val="en-US"/>
+        </w:rPr>
+        <w:t>” folder)</w:t>
+      </w:r>
+      <w:r>
+        <w:rPr>
+          <w:lang w:val="en-US"/>
+        </w:rPr>
+        <w:t>.</w:t>
       </w:r>
     </w:p>
     <w:p>
@@ -3739,7 +4158,6 @@
         <w:rPr>
           <w:lang w:val="en-US"/>
         </w:rPr>
-        <w:lastRenderedPageBreak/>
         <w:t xml:space="preserve">6. </w:t>
       </w:r>
       <w:r>
@@ -3864,6 +4282,7 @@
         <w:rPr>
           <w:lang w:val="en-US"/>
         </w:rPr>
+        <w:lastRenderedPageBreak/>
         <w:t xml:space="preserve">If when opening a CSV file everything is condensed into a single column, you can change this in </w:t>
       </w:r>
       <w:r>
@@ -4039,7 +4458,7 @@
           <w:lang w:val="en-US"/>
         </w:rPr>
       </w:pPr>
-      <w:hyperlink r:id="rId15" w:history="1">
+      <w:hyperlink r:id="rId17" w:history="1">
         <w:r>
           <w:rPr>
             <w:rStyle w:val="Hyperlink"/>
@@ -4151,7 +4570,7 @@
           <w:lang w:val="en-US"/>
         </w:rPr>
       </w:pPr>
-      <w:hyperlink r:id="rId16" w:history="1">
+      <w:hyperlink r:id="rId18" w:history="1">
         <w:r>
           <w:rPr>
             <w:rStyle w:val="Hyperlink"/>
@@ -4310,7 +4729,6 @@
           <w:color w:val="FF0000"/>
           <w:lang w:val="en-US"/>
         </w:rPr>
-        <w:lastRenderedPageBreak/>
         <w:t>Fallback Method</w:t>
       </w:r>
       <w:r>
@@ -4435,6 +4853,7 @@
         <w:rPr>
           <w:lang w:val="en-US"/>
         </w:rPr>
+        <w:lastRenderedPageBreak/>
         <w:t>A brief description of what happens</w:t>
       </w:r>
     </w:p>
@@ -4563,7 +4982,7 @@
           <w:lang w:val="en-US"/>
         </w:rPr>
       </w:pPr>
-      <w:hyperlink r:id="rId17" w:history="1">
+      <w:hyperlink r:id="rId19" w:history="1">
         <w:r>
           <w:rPr>
             <w:rStyle w:val="Hyperlink"/>
@@ -4978,7 +5397,6 @@
         <w:rPr>
           <w:lang w:val="en-US"/>
         </w:rPr>
-        <w:lastRenderedPageBreak/>
         <w:t>7.3</w:t>
       </w:r>
       <w:r>
@@ -5128,6 +5546,7 @@
         <w:rPr>
           <w:lang w:val="en-US"/>
         </w:rPr>
+        <w:lastRenderedPageBreak/>
         <w:t xml:space="preserve">Open </w:t>
       </w:r>
       <w:r>
@@ -5400,7 +5819,7 @@
           <w:lang w:val="en-US"/>
         </w:rPr>
       </w:pPr>
-      <w:hyperlink r:id="rId18" w:history="1">
+      <w:hyperlink r:id="rId20" w:history="1">
         <w:r>
           <w:rPr>
             <w:rStyle w:val="Hyperlink"/>
@@ -5449,7 +5868,7 @@
                     </pic:cNvPicPr>
                   </pic:nvPicPr>
                   <pic:blipFill>
-                    <a:blip r:embed="rId19">
+                    <a:blip r:embed="rId21">
                       <a:extLst>
                         <a:ext uri="{28A0092B-C50C-407E-A947-70E740481C1C}">
                           <a14:useLocalDpi xmlns:a14="http://schemas.microsoft.com/office/drawing/2010/main" val="0"/>

</xml_diff>